<commit_message>
Report Ship Box fixed
</commit_message>
<xml_diff>
--- a/WarehouseShipmentBoxList.docx
+++ b/WarehouseShipmentBoxList.docx
@@ -130,29 +130,23 @@
         <w:t>Customer:</w:t>
       </w:r>
       <w:r>
-        <w:rPr>
-          <w:b/>
-          <w:bCs/>
-        </w:rPr>
         <w:t xml:space="preserve"> </w:t>
       </w:r>
       <w:sdt>
         <w:sdtPr>
-          <w:id w:val="-1185515668"/>
+          <w:alias w:val="#Nav: /PostedWhseShipmentHeader/CustomerName"/>
+          <w:tag w:val="#Nav: Warehouse_Shipment_Box_List/50201"/>
+          <w:id w:val="-836608463"/>
           <w:placeholder>
             <w:docPart w:val="DefaultPlaceholder_-1854013440"/>
           </w:placeholder>
-          <w:dataBinding w:prefixMappings="xmlns:ns0='urn:microsoft-dynamics-nav/reports/Warehouse_Shipment_Box_List/50201/' " w:xpath="/ns0:NavWordReportXmlPart[1]/ns0:WarehouseShipmentHeader[1]/ns0:CompanyName[1]" w:storeItemID="{C37B3E90-E2FD-4400-9238-036CBD5CD8DB}"/>
+          <w:dataBinding w:prefixMappings="xmlns:ns0='urn:microsoft-dynamics-nav/reports/Warehouse_Shipment_Box_List/50201/' " w:xpath="/ns0:NavWordReportXmlPart[1]/ns0:PostedWhseShipmentHeader[1]/ns0:CustomerName[1]" w:storeItemID="{C37B3E90-E2FD-4400-9238-036CBD5CD8DB}"/>
           <w:text/>
-          <w:alias w:val="#Nav: /WarehouseShipmentHeader/CompanyName"/>
-          <w:tag w:val="#Nav: Warehouse_Shipment_Box_List/50201"/>
         </w:sdtPr>
         <w:sdtContent>
-          <w:proofErr w:type="spellStart"/>
           <w:r>
-            <w:t>CompanyName</w:t>
+            <w:t>CustomerName</w:t>
           </w:r>
-          <w:proofErr w:type="spellEnd"/>
         </w:sdtContent>
       </w:sdt>
     </w:p>
@@ -162,18 +156,25 @@
           <w:b/>
           <w:bCs/>
         </w:rPr>
-        <w:t xml:space="preserve">Shipment No.: </w:t>
+        <w:t>Shipment No</w:t>
+      </w:r>
+      <w:r>
+        <w:rPr>
+          <w:b/>
+          <w:bCs/>
+        </w:rPr>
+        <w:t xml:space="preserve">.: </w:t>
       </w:r>
       <w:sdt>
         <w:sdtPr>
-          <w:id w:val="755555678"/>
+          <w:alias w:val="#Nav: /PostedWhseShipmentHeader/No_WhseShptHeader"/>
+          <w:tag w:val="#Nav: Warehouse_Shipment_Box_List/50201"/>
+          <w:id w:val="-1204325638"/>
           <w:placeholder>
             <w:docPart w:val="DefaultPlaceholder_-1854013440"/>
           </w:placeholder>
-          <w:dataBinding w:prefixMappings="xmlns:ns0='urn:microsoft-dynamics-nav/reports/Warehouse_Shipment_Box_List/50201/' " w:xpath="/ns0:NavWordReportXmlPart[1]/ns0:WarehouseShipmentHeader[1]/ns0:No_WhseShptHeader[1]" w:storeItemID="{C37B3E90-E2FD-4400-9238-036CBD5CD8DB}"/>
+          <w:dataBinding w:prefixMappings="xmlns:ns0='urn:microsoft-dynamics-nav/reports/Warehouse_Shipment_Box_List/50201/' " w:xpath="/ns0:NavWordReportXmlPart[1]/ns0:PostedWhseShipmentHeader[1]/ns0:No_WhseShptHeader[1]" w:storeItemID="{C37B3E90-E2FD-4400-9238-036CBD5CD8DB}"/>
           <w:text/>
-          <w:alias w:val="#Nav: /WarehouseShipmentHeader/No_WhseShptHeader"/>
-          <w:tag w:val="#Nav: Warehouse_Shipment_Box_List/50201"/>
         </w:sdtPr>
         <w:sdtContent>
           <w:proofErr w:type="spellStart"/>
@@ -190,18 +191,25 @@
           <w:b/>
           <w:bCs/>
         </w:rPr>
-        <w:t xml:space="preserve">Shipment Date: </w:t>
+        <w:t>Shipment Date:</w:t>
+      </w:r>
+      <w:r>
+        <w:rPr>
+          <w:b/>
+          <w:bCs/>
+        </w:rPr>
+        <w:t xml:space="preserve"> </w:t>
       </w:r>
       <w:sdt>
         <w:sdtPr>
-          <w:id w:val="-1535953795"/>
+          <w:alias w:val="#Nav: /PostedWhseShipmentHeader/ShipmentDate_WhseShptHeader"/>
+          <w:tag w:val="#Nav: Warehouse_Shipment_Box_List/50201"/>
+          <w:id w:val="1952125445"/>
           <w:placeholder>
             <w:docPart w:val="DefaultPlaceholder_-1854013440"/>
           </w:placeholder>
-          <w:dataBinding w:prefixMappings="xmlns:ns0='urn:microsoft-dynamics-nav/reports/Warehouse_Shipment_Box_List/50201/' " w:xpath="/ns0:NavWordReportXmlPart[1]/ns0:WarehouseShipmentHeader[1]/ns0:ShipmentDate_WhseShptHeader[1]" w:storeItemID="{C37B3E90-E2FD-4400-9238-036CBD5CD8DB}"/>
+          <w:dataBinding w:prefixMappings="xmlns:ns0='urn:microsoft-dynamics-nav/reports/Warehouse_Shipment_Box_List/50201/' " w:xpath="/ns0:NavWordReportXmlPart[1]/ns0:PostedWhseShipmentHeader[1]/ns0:ShipmentDate_WhseShptHeader[1]" w:storeItemID="{C37B3E90-E2FD-4400-9238-036CBD5CD8DB}"/>
           <w:text/>
-          <w:alias w:val="#Nav: /WarehouseShipmentHeader/ShipmentDate_WhseShptHeader"/>
-          <w:tag w:val="#Nav: Warehouse_Shipment_Box_List/50201"/>
         </w:sdtPr>
         <w:sdtContent>
           <w:proofErr w:type="spellStart"/>
@@ -211,63 +219,12 @@
           <w:proofErr w:type="spellEnd"/>
         </w:sdtContent>
       </w:sdt>
-      <w:r>
-        <w:t xml:space="preserve"> </w:t>
-      </w:r>
-    </w:p>
-    <w:p>
-      <w:r>
-        <w:rPr>
-          <w:b/>
-          <w:bCs/>
-        </w:rPr>
-        <w:t xml:space="preserve">Total Boxes </w:t>
-      </w:r>
-      <w:r>
-        <w:rPr>
-          <w:b/>
-          <w:bCs/>
-        </w:rPr>
-        <w:t>i</w:t>
-      </w:r>
-      <w:r>
-        <w:rPr>
-          <w:b/>
-          <w:bCs/>
-        </w:rPr>
-        <w:t>n Shipment:</w:t>
-      </w:r>
-      <w:r>
-        <w:t xml:space="preserve"> </w:t>
-      </w:r>
-      <w:sdt>
-        <w:sdtPr>
-          <w:id w:val="-1891802097"/>
-          <w:placeholder>
-            <w:docPart w:val="DefaultPlaceholder_-1854013440"/>
-          </w:placeholder>
-          <w:dataBinding w:prefixMappings="xmlns:ns0='urn:microsoft-dynamics-nav/reports/Warehouse_Shipment_Box_List/50201/' " w:xpath="/ns0:NavWordReportXmlPart[1]/ns0:WarehouseShipmentHeader[1]/ns0:TotalBoxesInShipment[1]" w:storeItemID="{C37B3E90-E2FD-4400-9238-036CBD5CD8DB}"/>
-          <w:text/>
-          <w:alias w:val="#Nav: /WarehouseShipmentHeader/TotalBoxesInShipment"/>
-          <w:tag w:val="#Nav: Warehouse_Shipment_Box_List/50201"/>
-        </w:sdtPr>
-        <w:sdtContent>
-          <w:proofErr w:type="spellStart"/>
-          <w:r>
-            <w:t>TotalBoxesInShipment</w:t>
-          </w:r>
-          <w:proofErr w:type="spellEnd"/>
-        </w:sdtContent>
-      </w:sdt>
-      <w:r>
-        <w:t xml:space="preserve"> </w:t>
-      </w:r>
     </w:p>
     <w:p/>
     <w:tbl>
       <w:tblPr>
         <w:tblStyle w:val="TableGrid"/>
-        <w:tblW w:w="14544" w:type="dxa"/>
+        <w:tblW w:w="12528" w:type="dxa"/>
         <w:tblBorders>
           <w:top w:val="none" w:color="auto" w:sz="0" w:space="0"/>
           <w:left w:val="none" w:color="auto" w:sz="0" w:space="0"/>
@@ -284,7 +241,6 @@
         <w:gridCol w:w="6192"/>
         <w:gridCol w:w="1152"/>
         <w:gridCol w:w="1440"/>
-        <w:gridCol w:w="2016"/>
         <w:gridCol w:w="2016"/>
       </w:tblGrid>
       <w:tr>
@@ -395,7 +351,6 @@
             <w:tcW w:w="2016" w:type="dxa"/>
             <w:tcBorders>
               <w:left w:val="single" w:color="auto" w:sz="4" w:space="0"/>
-              <w:right w:val="single" w:color="auto" w:sz="4" w:space="0"/>
             </w:tcBorders>
           </w:tcPr>
           <w:p>
@@ -415,45 +370,21 @@
             </w:r>
           </w:p>
         </w:tc>
-        <w:tc>
-          <w:tcPr>
-            <w:tcW w:w="2016" w:type="dxa"/>
-            <w:tcBorders>
-              <w:left w:val="single" w:color="auto" w:sz="4" w:space="0"/>
-            </w:tcBorders>
-          </w:tcPr>
-          <w:p>
-            <w:pPr>
-              <w:jc w:val="center"/>
-              <w:rPr>
-                <w:b/>
-                <w:bCs/>
-              </w:rPr>
-            </w:pPr>
-            <w:r>
-              <w:rPr>
-                <w:b/>
-                <w:bCs/>
-              </w:rPr>
-              <w:t>Sales Order No.</w:t>
-            </w:r>
-          </w:p>
-        </w:tc>
       </w:tr>
       <w:sdt>
         <w:sdtPr>
-          <w:id w:val="-1280026739"/>
-          <w15:dataBinding w:prefixMappings="xmlns:ns0='urn:microsoft-dynamics-nav/reports/Warehouse_Shipment_Box_List/50201/' " w:xpath="/ns0:NavWordReportXmlPart[1]/ns0:WarehouseShipmentHeader[1]/ns0:WarehouseBox" w:storeItemID="{C37B3E90-E2FD-4400-9238-036CBD5CD8DB}"/>
+          <w:alias w:val="#Nav: /PostedWhseShipmentHeader/PostedWhseShipmentLine"/>
+          <w:tag w:val="#Nav: Warehouse_Shipment_Box_List/50201"/>
+          <w:id w:val="1704511788"/>
+          <w15:dataBinding w:prefixMappings="xmlns:ns0='urn:microsoft-dynamics-nav/reports/Warehouse_Shipment_Box_List/50201/' " w:xpath="/ns0:NavWordReportXmlPart[1]/ns0:PostedWhseShipmentHeader[1]/ns0:PostedWhseShipmentLine" w:storeItemID="{C37B3E90-E2FD-4400-9238-036CBD5CD8DB}"/>
           <w15:repeatingSection/>
-          <w:alias w:val="#Nav: /WarehouseShipmentHeader/WarehouseBox"/>
-          <w:tag w:val="#Nav: Warehouse_Shipment_Box_List/50201"/>
         </w:sdtPr>
         <w:sdtContent>
           <w:sdt>
             <w:sdtPr>
-              <w:id w:val="1048187418"/>
+              <w:id w:val="-1436736069"/>
               <w:placeholder>
-                <w:docPart w:val="A2E92ED8B1A246E6A0DD7797B75A32AA"/>
+                <w:docPart w:val="DefaultPlaceholder_-1854013435"/>
               </w:placeholder>
               <w15:repeatingSectionItem/>
             </w:sdtPr>
@@ -464,14 +395,14 @@
                 </w:trPr>
                 <w:sdt>
                   <w:sdtPr>
-                    <w:id w:val="437252247"/>
+                    <w:alias w:val="#Nav: /PostedWhseShipmentHeader/PostedWhseShipmentLine/ItemNo_Line"/>
+                    <w:tag w:val="#Nav: Warehouse_Shipment_Box_List/50201"/>
+                    <w:id w:val="-2044817860"/>
                     <w:placeholder>
-                      <w:docPart w:val="7774A7FEE3044EF784454E92F1A121A8"/>
+                      <w:docPart w:val="DefaultPlaceholder_-1854013440"/>
                     </w:placeholder>
-                    <w:dataBinding w:prefixMappings="xmlns:ns0='urn:microsoft-dynamics-nav/reports/Warehouse_Shipment_Box_List/50201/' " w:xpath="/ns0:NavWordReportXmlPart[1]/ns0:WarehouseShipmentHeader[1]/ns0:WarehouseBox[1]/ns0:WarehouseBoxContent[1]/ns0:ItemNo_BoxContent[1]" w:storeItemID="{C37B3E90-E2FD-4400-9238-036CBD5CD8DB}"/>
+                    <w:dataBinding w:prefixMappings="xmlns:ns0='urn:microsoft-dynamics-nav/reports/Warehouse_Shipment_Box_List/50201/' " w:xpath="/ns0:NavWordReportXmlPart[1]/ns0:PostedWhseShipmentHeader[1]/ns0:PostedWhseShipmentLine[1]/ns0:ItemNo_Line[1]" w:storeItemID="{C37B3E90-E2FD-4400-9238-036CBD5CD8DB}"/>
                     <w:text/>
-                    <w:alias w:val="#Nav: /WarehouseShipmentHeader/WarehouseBox/WarehouseBoxContent/ItemNo_BoxContent"/>
-                    <w:tag w:val="#Nav: Warehouse_Shipment_Box_List/50201"/>
                   </w:sdtPr>
                   <w:sdtContent>
                     <w:tc>
@@ -487,7 +418,7 @@
                         </w:pPr>
                         <w:proofErr w:type="spellStart"/>
                         <w:r>
-                          <w:t>ItemNo_BoxContent</w:t>
+                          <w:t>ItemNo_Line</w:t>
                         </w:r>
                         <w:proofErr w:type="spellEnd"/>
                       </w:p>
@@ -496,14 +427,14 @@
                 </w:sdt>
                 <w:sdt>
                   <w:sdtPr>
-                    <w:id w:val="-286046466"/>
+                    <w:alias w:val="#Nav: /PostedWhseShipmentHeader/PostedWhseShipmentLine/ItemDescription_Line"/>
+                    <w:tag w:val="#Nav: Warehouse_Shipment_Box_List/50201"/>
+                    <w:id w:val="746850144"/>
                     <w:placeholder>
-                      <w:docPart w:val="7774A7FEE3044EF784454E92F1A121A8"/>
+                      <w:docPart w:val="DefaultPlaceholder_-1854013440"/>
                     </w:placeholder>
-                    <w:dataBinding w:prefixMappings="xmlns:ns0='urn:microsoft-dynamics-nav/reports/Warehouse_Shipment_Box_List/50201/' " w:xpath="/ns0:NavWordReportXmlPart[1]/ns0:WarehouseShipmentHeader[1]/ns0:WarehouseBox[1]/ns0:WarehouseBoxContent[1]/ns0:ItemDescription_BoxContent[1]" w:storeItemID="{C37B3E90-E2FD-4400-9238-036CBD5CD8DB}"/>
+                    <w:dataBinding w:prefixMappings="xmlns:ns0='urn:microsoft-dynamics-nav/reports/Warehouse_Shipment_Box_List/50201/' " w:xpath="/ns0:NavWordReportXmlPart[1]/ns0:PostedWhseShipmentHeader[1]/ns0:PostedWhseShipmentLine[1]/ns0:ItemDescription_Line[1]" w:storeItemID="{C37B3E90-E2FD-4400-9238-036CBD5CD8DB}"/>
                     <w:text/>
-                    <w:alias w:val="#Nav: /WarehouseShipmentHeader/WarehouseBox/WarehouseBoxContent/ItemDescription_BoxContent"/>
-                    <w:tag w:val="#Nav: Warehouse_Shipment_Box_List/50201"/>
                   </w:sdtPr>
                   <w:sdtContent>
                     <w:tc>
@@ -519,13 +450,8 @@
                           <w:jc w:val="center"/>
                         </w:pPr>
                         <w:proofErr w:type="spellStart"/>
-                        <w:proofErr w:type="gramStart"/>
                         <w:r>
-                          <w:t>ItemDescription</w:t>
-                        </w:r>
-                        <w:proofErr w:type="gramEnd"/>
-                        <w:r>
-                          <w:t>_BoxContent</w:t>
+                          <w:t>ItemDescription_Line</w:t>
                         </w:r>
                         <w:proofErr w:type="spellEnd"/>
                       </w:p>
@@ -534,14 +460,14 @@
                 </w:sdt>
                 <w:sdt>
                   <w:sdtPr>
-                    <w:id w:val="-344635597"/>
+                    <w:alias w:val="#Nav: /PostedWhseShipmentHeader/PostedWhseShipmentLine/Quantity_Line"/>
+                    <w:tag w:val="#Nav: Warehouse_Shipment_Box_List/50201"/>
+                    <w:id w:val="-268782516"/>
                     <w:placeholder>
-                      <w:docPart w:val="7774A7FEE3044EF784454E92F1A121A8"/>
+                      <w:docPart w:val="DefaultPlaceholder_-1854013440"/>
                     </w:placeholder>
-                    <w:dataBinding w:prefixMappings="xmlns:ns0='urn:microsoft-dynamics-nav/reports/Warehouse_Shipment_Box_List/50201/' " w:xpath="/ns0:NavWordReportXmlPart[1]/ns0:WarehouseShipmentHeader[1]/ns0:WarehouseBox[1]/ns0:WarehouseBoxContent[1]/ns0:Quantity_BoxContent[1]" w:storeItemID="{C37B3E90-E2FD-4400-9238-036CBD5CD8DB}"/>
+                    <w:dataBinding w:prefixMappings="xmlns:ns0='urn:microsoft-dynamics-nav/reports/Warehouse_Shipment_Box_List/50201/' " w:xpath="/ns0:NavWordReportXmlPart[1]/ns0:PostedWhseShipmentHeader[1]/ns0:PostedWhseShipmentLine[1]/ns0:Quantity_Line[1]" w:storeItemID="{C37B3E90-E2FD-4400-9238-036CBD5CD8DB}"/>
                     <w:text/>
-                    <w:alias w:val="#Nav: /WarehouseShipmentHeader/WarehouseBox/WarehouseBoxContent/Quantity_BoxContent"/>
-                    <w:tag w:val="#Nav: Warehouse_Shipment_Box_List/50201"/>
                   </w:sdtPr>
                   <w:sdtContent>
                     <w:tc>
@@ -558,7 +484,7 @@
                         </w:pPr>
                         <w:proofErr w:type="spellStart"/>
                         <w:r>
-                          <w:t>Quantity_BoxContent</w:t>
+                          <w:t>Quantity_Line</w:t>
                         </w:r>
                         <w:proofErr w:type="spellEnd"/>
                       </w:p>
@@ -567,14 +493,14 @@
                 </w:sdt>
                 <w:sdt>
                   <w:sdtPr>
-                    <w:id w:val="1882051537"/>
+                    <w:alias w:val="#Nav: /PostedWhseShipmentHeader/PostedWhseShipmentLine/UnitOfMeasure_Line"/>
+                    <w:tag w:val="#Nav: Warehouse_Shipment_Box_List/50201"/>
+                    <w:id w:val="1011181181"/>
                     <w:placeholder>
-                      <w:docPart w:val="7774A7FEE3044EF784454E92F1A121A8"/>
+                      <w:docPart w:val="DefaultPlaceholder_-1854013440"/>
                     </w:placeholder>
-                    <w:dataBinding w:prefixMappings="xmlns:ns0='urn:microsoft-dynamics-nav/reports/Warehouse_Shipment_Box_List/50201/' " w:xpath="/ns0:NavWordReportXmlPart[1]/ns0:WarehouseShipmentHeader[1]/ns0:WarehouseBox[1]/ns0:WarehouseBoxContent[1]/ns0:UnitOfMeasure_BoxContent[1]" w:storeItemID="{C37B3E90-E2FD-4400-9238-036CBD5CD8DB}"/>
+                    <w:dataBinding w:prefixMappings="xmlns:ns0='urn:microsoft-dynamics-nav/reports/Warehouse_Shipment_Box_List/50201/' " w:xpath="/ns0:NavWordReportXmlPart[1]/ns0:PostedWhseShipmentHeader[1]/ns0:PostedWhseShipmentLine[1]/ns0:UnitOfMeasure_Line[1]" w:storeItemID="{C37B3E90-E2FD-4400-9238-036CBD5CD8DB}"/>
                     <w:text/>
-                    <w:alias w:val="#Nav: /WarehouseShipmentHeader/WarehouseBox/WarehouseBoxContent/UnitOfMeasure_BoxContent"/>
-                    <w:tag w:val="#Nav: Warehouse_Shipment_Box_List/50201"/>
                   </w:sdtPr>
                   <w:sdtContent>
                     <w:tc>
@@ -591,7 +517,7 @@
                         </w:pPr>
                         <w:proofErr w:type="spellStart"/>
                         <w:r>
-                          <w:t>UnitOfMeasure_BoxContent</w:t>
+                          <w:t>UnitOfMeasure_Line</w:t>
                         </w:r>
                         <w:proofErr w:type="spellEnd"/>
                       </w:p>
@@ -600,47 +526,14 @@
                 </w:sdt>
                 <w:sdt>
                   <w:sdtPr>
-                    <w:id w:val="-157153687"/>
+                    <w:alias w:val="#Nav: /PostedWhseShipmentHeader/PostedWhseShipmentLine/BoxNo_Line"/>
+                    <w:tag w:val="#Nav: Warehouse_Shipment_Box_List/50201"/>
+                    <w:id w:val="-1432342986"/>
                     <w:placeholder>
-                      <w:docPart w:val="7774A7FEE3044EF784454E92F1A121A8"/>
+                      <w:docPart w:val="DefaultPlaceholder_-1854013440"/>
                     </w:placeholder>
-                    <w:dataBinding w:prefixMappings="xmlns:ns0='urn:microsoft-dynamics-nav/reports/Warehouse_Shipment_Box_List/50201/' " w:xpath="/ns0:NavWordReportXmlPart[1]/ns0:WarehouseShipmentHeader[1]/ns0:WarehouseBox[1]/ns0:BoxNo_WhseBox[1]" w:storeItemID="{C37B3E90-E2FD-4400-9238-036CBD5CD8DB}"/>
+                    <w:dataBinding w:prefixMappings="xmlns:ns0='urn:microsoft-dynamics-nav/reports/Warehouse_Shipment_Box_List/50201/' " w:xpath="/ns0:NavWordReportXmlPart[1]/ns0:PostedWhseShipmentHeader[1]/ns0:PostedWhseShipmentLine[1]/ns0:BoxNo_Line[1]" w:storeItemID="{C37B3E90-E2FD-4400-9238-036CBD5CD8DB}"/>
                     <w:text/>
-                    <w:alias w:val="#Nav: /WarehouseShipmentHeader/WarehouseBox/BoxNo_WhseBox"/>
-                    <w:tag w:val="#Nav: Warehouse_Shipment_Box_List/50201"/>
-                  </w:sdtPr>
-                  <w:sdtContent>
-                    <w:tc>
-                      <w:tcPr>
-                        <w:tcW w:w="2016" w:type="dxa"/>
-                        <w:tcBorders>
-                          <w:left w:val="single" w:color="auto" w:sz="4" w:space="0"/>
-                          <w:right w:val="single" w:color="auto" w:sz="4" w:space="0"/>
-                        </w:tcBorders>
-                      </w:tcPr>
-                      <w:p>
-                        <w:pPr>
-                          <w:jc w:val="center"/>
-                        </w:pPr>
-                        <w:proofErr w:type="spellStart"/>
-                        <w:r>
-                          <w:t>BoxNo_WhseBox</w:t>
-                        </w:r>
-                        <w:proofErr w:type="spellEnd"/>
-                      </w:p>
-                    </w:tc>
-                  </w:sdtContent>
-                </w:sdt>
-                <w:sdt>
-                  <w:sdtPr>
-                    <w:id w:val="812683677"/>
-                    <w:placeholder>
-                      <w:docPart w:val="7774A7FEE3044EF784454E92F1A121A8"/>
-                    </w:placeholder>
-                    <w:dataBinding w:prefixMappings="xmlns:ns0='urn:microsoft-dynamics-nav/reports/Warehouse_Shipment_Box_List/50201/' " w:xpath="/ns0:NavWordReportXmlPart[1]/ns0:WarehouseShipmentHeader[1]/ns0:WarehouseBox[1]/ns0:SalesOrderNo_WhseBox[1]" w:storeItemID="{C37B3E90-E2FD-4400-9238-036CBD5CD8DB}"/>
-                    <w:text/>
-                    <w:alias w:val="#Nav: /WarehouseShipmentHeader/WarehouseBox/SalesOrderNo_WhseBox"/>
-                    <w:tag w:val="#Nav: Warehouse_Shipment_Box_List/50201"/>
                   </w:sdtPr>
                   <w:sdtContent>
                     <w:tc>
@@ -656,7 +549,7 @@
                         </w:pPr>
                         <w:proofErr w:type="spellStart"/>
                         <w:r>
-                          <w:t>SalesOrderNo_WhseBox</w:t>
+                          <w:t>BoxNo_Line</w:t>
                         </w:r>
                         <w:proofErr w:type="spellEnd"/>
                       </w:p>
@@ -1171,7 +1064,7 @@
     </w:docPart>
     <w:docPart>
       <w:docPartPr>
-        <w:name w:val="A2E92ED8B1A246E6A0DD7797B75A32AA"/>
+        <w:name w:val="DefaultPlaceholder_-1854013435"/>
         <w:category>
           <w:name w:val="General"/>
           <w:gallery w:val="placeholder"/>
@@ -1182,47 +1075,15 @@
         <w:behaviors>
           <w:behavior w:val="content"/>
         </w:behaviors>
-        <w:guid w:val="{D432C53F-92BD-4122-B388-B1807D51C85D}"/>
+        <w:guid w:val="{F7AB6C41-AFD7-458E-86A8-1D720A74C18C}"/>
       </w:docPartPr>
       <w:docPartBody>
         <w:p>
-          <w:pPr>
-            <w:pStyle w:val="A2E92ED8B1A246E6A0DD7797B75A32AA"/>
-          </w:pPr>
           <w:r>
             <w:rPr>
               <w:rStyle w:val="PlaceholderText"/>
             </w:rPr>
             <w:t>Enter any content that you want to repeat, including other content controls. You can also insert this control around table rows in order to repeat parts of a table.</w:t>
-          </w:r>
-        </w:p>
-      </w:docPartBody>
-    </w:docPart>
-    <w:docPart>
-      <w:docPartPr>
-        <w:name w:val="7774A7FEE3044EF784454E92F1A121A8"/>
-        <w:category>
-          <w:name w:val="General"/>
-          <w:gallery w:val="placeholder"/>
-        </w:category>
-        <w:types>
-          <w:type w:val="bbPlcHdr"/>
-        </w:types>
-        <w:behaviors>
-          <w:behavior w:val="content"/>
-        </w:behaviors>
-        <w:guid w:val="{0B943F4B-6132-4E2F-985D-704A572CC9B8}"/>
-      </w:docPartPr>
-      <w:docPartBody>
-        <w:p>
-          <w:pPr>
-            <w:pStyle w:val="7774A7FEE3044EF784454E92F1A121A8"/>
-          </w:pPr>
-          <w:r>
-            <w:rPr>
-              <w:rStyle w:val="PlaceholderText"/>
-            </w:rPr>
-            <w:t>Click or tap here to enter text.</w:t>
           </w:r>
         </w:p>
       </w:docPartBody>
@@ -1271,8 +1132,22 @@
   </w:compat>
   <w:rsids>
     <w:rsidRoot w:val="006B1840"/>
+    <w:rsid w:val="000E720C"/>
+    <w:rsid w:val="001323A0"/>
+    <w:rsid w:val="001B64D8"/>
+    <w:rsid w:val="0030384B"/>
+    <w:rsid w:val="005251DE"/>
+    <w:rsid w:val="00616B43"/>
+    <w:rsid w:val="00696EF2"/>
     <w:rsid w:val="006B1840"/>
+    <w:rsid w:val="007C497C"/>
+    <w:rsid w:val="007E7CB4"/>
     <w:rsid w:val="00AB06A8"/>
+    <w:rsid w:val="00C3456E"/>
+    <w:rsid w:val="00C409ED"/>
+    <w:rsid w:val="00ED7FF8"/>
+    <w:rsid w:val="00F30745"/>
+    <w:rsid w:val="00F75EC2"/>
   </w:rsids>
   <m:mathPr>
     <m:mathFont m:val="Cambria Math"/>
@@ -1728,50 +1603,10 @@
     <w:basedOn w:val="DefaultParagraphFont"/>
     <w:uiPriority w:val="99"/>
     <w:semiHidden/>
-    <w:rsid w:val="006B1840"/>
+    <w:rsid w:val="000E720C"/>
     <w:rPr>
       <w:color w:val="666666"/>
     </w:rPr>
-  </w:style>
-  <w:style w:type="paragraph" w:customStyle="1" w:styleId="A6191624CCD94EC1A0847E64E80E2341">
-    <w:name w:val="A6191624CCD94EC1A0847E64E80E2341"/>
-    <w:rsid w:val="006B1840"/>
-  </w:style>
-  <w:style w:type="paragraph" w:customStyle="1" w:styleId="AF506C8AA9F34EB6912DC50DB27F239D">
-    <w:name w:val="AF506C8AA9F34EB6912DC50DB27F239D"/>
-    <w:rsid w:val="006B1840"/>
-  </w:style>
-  <w:style w:type="paragraph" w:customStyle="1" w:styleId="C885152934F84C4A974B9D9CA8ACF920">
-    <w:name w:val="C885152934F84C4A974B9D9CA8ACF920"/>
-    <w:rsid w:val="006B1840"/>
-  </w:style>
-  <w:style w:type="paragraph" w:customStyle="1" w:styleId="B92B49A533C84926A9B4F8303C91549F">
-    <w:name w:val="B92B49A533C84926A9B4F8303C91549F"/>
-    <w:rsid w:val="006B1840"/>
-  </w:style>
-  <w:style w:type="paragraph" w:customStyle="1" w:styleId="30F2F42CC3F040C39E354AF2AC682C72">
-    <w:name w:val="30F2F42CC3F040C39E354AF2AC682C72"/>
-    <w:rsid w:val="006B1840"/>
-  </w:style>
-  <w:style w:type="paragraph" w:customStyle="1" w:styleId="5D9687A815C54B5D9097581659EBC939">
-    <w:name w:val="5D9687A815C54B5D9097581659EBC939"/>
-    <w:rsid w:val="006B1840"/>
-  </w:style>
-  <w:style w:type="paragraph" w:customStyle="1" w:styleId="B167B3410113443E853E93425AB481DE">
-    <w:name w:val="B167B3410113443E853E93425AB481DE"/>
-    <w:rsid w:val="006B1840"/>
-  </w:style>
-  <w:style w:type="paragraph" w:customStyle="1" w:styleId="A874B471E05646EDA134A66FDBFFA226">
-    <w:name w:val="A874B471E05646EDA134A66FDBFFA226"/>
-    <w:rsid w:val="006B1840"/>
-  </w:style>
-  <w:style w:type="paragraph" w:customStyle="1" w:styleId="A2E92ED8B1A246E6A0DD7797B75A32AA">
-    <w:name w:val="A2E92ED8B1A246E6A0DD7797B75A32AA"/>
-    <w:rsid w:val="006B1840"/>
-  </w:style>
-  <w:style w:type="paragraph" w:customStyle="1" w:styleId="7774A7FEE3044EF784454E92F1A121A8">
-    <w:name w:val="7774A7FEE3044EF784454E92F1A121A8"/>
-    <w:rsid w:val="006B1840"/>
   </w:style>
 </w:styles>
 </file>
@@ -2174,6 +2009,8 @@
  
          < B o x N o L b l > B o x N o L b l < / B o x N o L b l >   
+         < C u s t o m e r L b l > C u s t o m e r L b l < / C u s t o m e r L b l > + 
          < D e s c r i p t i o n L b l > D e s c r i p t i o n L b l < / D e s c r i p t i o n L b l >   
          < I t e m N o L b l > I t e m N o L b l < / I t e m N o L b l > @@ -2200,10 +2037,14 @@
  
      < / L a b e l s >   
-     < W a r e h o u s e S h i p m e n t H e a d e r > +     < P o s t e d W h s e S h i p m e n t H e a d e r >   
          < C o m p a n y N a m e > C o m p a n y N a m e < / C o m p a n y N a m e >   
+         < C u s t o m e r A d d r e s s > C u s t o m e r A d d r e s s < / C u s t o m e r A d d r e s s > + 
+         < C u s t o m e r N a m e > C u s t o m e r N a m e < / C u s t o m e r N a m e > + 
          < E x t e r n a l D o c u m e n t N o > E x t e r n a l D o c u m e n t N o < / E x t e r n a l D o c u m e n t N o >   
          < L o c a t i o n C o d e _ W h s e S h p t H e a d e r > L o c a t i o n C o d e _ W h s e S h p t H e a d e r < / L o c a t i o n C o d e _ W h s e S h p t H e a d e r > @@ -2218,6 +2059,26 @@
  
          < T o t a l B o x e s I n S h i p m e n t > T o t a l B o x e s I n S h i p m e n t < / T o t a l B o x e s I n S h i p m e n t >   
+         < T o t a l I t e m s I n S h i p m e n t > T o t a l I t e m s I n S h i p m e n t < / T o t a l I t e m s I n S h i p m e n t > + 
+         < P o s t e d W h s e S h i p m e n t L i n e > + 
+             < B i n C o d e _ L i n e > B i n C o d e _ L i n e < / B i n C o d e _ L i n e > + 
+             < B o x N o _ L i n e > B o x N o _ L i n e < / B o x N o _ L i n e > + 
+             < I t e m D e s c r i p t i o n _ L i n e > I t e m D e s c r i p t i o n _ L i n e < / I t e m D e s c r i p t i o n _ L i n e > + 
+             < I t e m N o _ L i n e > I t e m N o _ L i n e < / I t e m N o _ L i n e > + 
+             < Q u a n t i t y _ L i n e > Q u a n t i t y _ L i n e < / Q u a n t i t y _ L i n e > + 
+             < S o u r c e N o _ L i n e > S o u r c e N o _ L i n e < / S o u r c e N o _ L i n e > + 
+             < U n i t O f M e a s u r e _ L i n e > U n i t O f M e a s u r e _ L i n e < / U n i t O f M e a s u r e _ L i n e > + 
+         < / P o s t e d W h s e S h i p m e n t L i n e > + 
          < W a r e h o u s e B o x >   
              < B o x D e s c r i p t i o n _ W h s e B o x > B o x D e s c r i p t i o n _ W h s e B o x < / B o x D e s c r i p t i o n _ W h s e B o x > @@ -2226,45 +2087,13 @@
  
              < B o x S t a t u s _ W h s e B o x > B o x S t a t u s _ W h s e B o x < / B o x S t a t u s _ W h s e B o x >   
-             < B o x T o t a l Q t y > B o x T o t a l Q t y < / B o x T o t a l Q t y > - 
              < C u r r e n t V o l u m e _ W h s e B o x > C u r r e n t V o l u m e _ W h s e B o x < / C u r r e n t V o l u m e _ W h s e B o x >   
              < C u r r e n t W e i g h t _ W h s e B o x > C u r r e n t W e i g h t _ W h s e B o x < / C u r r e n t W e i g h t _ W h s e B o x >   
-             < M a x V o l u m e _ W h s e B o x > M a x V o l u m e _ W h s e B o x < / M a x V o l u m e _ W h s e B o x > - 
-             < M a x W e i g h t _ W h s e B o x > M a x W e i g h t _ W h s e B o x < / M a x W e i g h t _ W h s e B o x > - 
-             < S a l e s O r d e r N o _ W h s e B o x > S a l e s O r d e r N o _ W h s e B o x < / S a l e s O r d e r N o _ W h s e B o x > - 
-             < T o t a l I t e m s I n B o x > T o t a l I t e m s I n B o x < / T o t a l I t e m s I n B o x > - 
-             < W a r e h o u s e B o x C o n t e n t > - 
-                 < B i n C o d e _ B o x C o n t e n t > B i n C o d e _ B o x C o n t e n t < / B i n C o d e _ B o x C o n t e n t > - 
-                 < I t e m D e s c r i p t i o n _ B o x C o n t e n t > I t e m D e s c r i p t i o n _ B o x C o n t e n t < / I t e m D e s c r i p t i o n _ B o x C o n t e n t > - 
-                 < I t e m N o _ B o x C o n t e n t > I t e m N o _ B o x C o n t e n t < / I t e m N o _ B o x C o n t e n t > - 
-                 < Q u a n t i t y _ B o x C o n t e n t > Q u a n t i t y _ B o x C o n t e n t < / Q u a n t i t y _ B o x C o n t e n t > - 
-                 < S o u r c e N o _ B o x C o n t e n t > S o u r c e N o _ B o x C o n t e n t < / S o u r c e N o _ B o x C o n t e n t > - 
-                 < T o t a l V o l u m e _ B o x C o n t e n t > T o t a l V o l u m e _ B o x C o n t e n t < / T o t a l V o l u m e _ B o x C o n t e n t > - 
-                 < T o t a l W e i g h t _ B o x C o n t e n t > T o t a l W e i g h t _ B o x C o n t e n t < / T o t a l W e i g h t _ B o x C o n t e n t > - 
-                 < U n i t O f M e a s u r e _ B o x C o n t e n t > U n i t O f M e a s u r e _ B o x C o n t e n t < / U n i t O f M e a s u r e _ B o x C o n t e n t > - 
-                 < V a r i a n t C o d e _ B o x C o n t e n t > V a r i a n t C o d e _ B o x C o n t e n t < / V a r i a n t C o d e _ B o x C o n t e n t > - 
-             < / W a r e h o u s e B o x C o n t e n t > - 
          < / W a r e h o u s e B o x >   
-     < / W a r e h o u s e S h i p m e n t H e a d e r > +     < / P o s t e d W h s e S h i p m e n t H e a d e r >   
  < / N a v W o r d R e p o r t X m l P a r t > 
 </file>
@@ -2343,6 +2172,8 @@
  
          < B o x N o L b l   E l e m e n t T y p e = " P a r a m e t e r "   E l e m e n t I d = " 4 4 3 8 5 3 4 0 3 "   D a t a T y p e = " S t r i n g " > B o x N o L b l < / B o x N o L b l >   
+         < C u s t o m e r L b l   E l e m e n t T y p e = " P a r a m e t e r "   E l e m e n t I d = " 2 0 7 1 4 2 2 0 2 1 "   D a t a T y p e = " S t r i n g " > C u s t o m e r L b l < / C u s t o m e r L b l > + 
          < D e s c r i p t i o n L b l   E l e m e n t T y p e = " P a r a m e t e r "   E l e m e n t I d = " 1 4 2 2 4 8 2 7 0 5 "   D a t a T y p e = " S t r i n g " > D e s c r i p t i o n L b l < / D e s c r i p t i o n L b l >   
          < I t e m N o L b l   E l e m e n t T y p e = " P a r a m e t e r "   E l e m e n t I d = " 1 7 9 0 6 2 1 1 1 5 "   D a t a T y p e = " S t r i n g " > I t e m N o L b l < / I t e m N o L b l > @@ -2371,10 +2202,14 @@
  
      < T o o l t i p s / >   
-     < W a r e h o u s e S h i p m e n t H e a d e r   E l e m e n t T y p e = " D a t a I t e m "   E l e m e n t I d = " 4 6 7 3 6 5 2 8 1 " > +     < P o s t e d W h s e S h i p m e n t H e a d e r   E l e m e n t T y p e = " D a t a I t e m "   E l e m e n t I d = " 2 3 4 3 6 1 8 9 4 " >   
          < C o m p a n y N a m e   E l e m e n t T y p e = " C o l u m n "   E l e m e n t I d = " 1 5 9 5 4 7 7 3 9 5 "   D a t a T y p e = " S t r i n g " > C o m p a n y N a m e < / C o m p a n y N a m e >   
+         < C u s t o m e r A d d r e s s   E l e m e n t T y p e = " C o l u m n "   E l e m e n t I d = " 1 9 0 6 3 5 5 5 1 1 "   D a t a T y p e = " T e x t " > C u s t o m e r A d d r e s s < / C u s t o m e r A d d r e s s > + 
+         < C u s t o m e r N a m e   E l e m e n t T y p e = " C o l u m n "   E l e m e n t I d = " 2 6 5 4 9 6 8 2 6 "   D a t a T y p e = " T e x t " > C u s t o m e r N a m e < / C u s t o m e r N a m e > + 
          < E x t e r n a l D o c u m e n t N o   E l e m e n t T y p e = " C o l u m n "   E l e m e n t I d = " 7 3 3 9 5 3 9 6 6 "   D a t a T y p e = " C o d e " > E x t e r n a l D o c u m e n t N o < / E x t e r n a l D o c u m e n t N o >   
          < L o c a t i o n C o d e _ W h s e S h p t H e a d e r   E l e m e n t T y p e = " C o l u m n "   E l e m e n t I d = " 2 4 4 1 6 2 5 7 1 "   D a t a T y p e = " C o d e " > L o c a t i o n C o d e _ W h s e S h p t H e a d e r < / L o c a t i o n C o d e _ W h s e S h p t H e a d e r > @@ -2389,6 +2224,26 @@
  
          < T o t a l B o x e s I n S h i p m e n t   E l e m e n t T y p e = " C o l u m n "   E l e m e n t I d = " 5 5 1 4 6 2 5 8 9 "   D a t a T y p e = " I n t e g e r " > T o t a l B o x e s I n S h i p m e n t < / T o t a l B o x e s I n S h i p m e n t >   
+         < T o t a l I t e m s I n S h i p m e n t   E l e m e n t T y p e = " C o l u m n "   E l e m e n t I d = " 4 9 6 0 7 1 5 4 6 "   D a t a T y p e = " I n t e g e r " > T o t a l I t e m s I n S h i p m e n t < / T o t a l I t e m s I n S h i p m e n t > + 
+         < P o s t e d W h s e S h i p m e n t L i n e   E l e m e n t T y p e = " D a t a I t e m "   E l e m e n t I d = " 7 2 4 7 7 5 0 5 3 " > + 
+             < B i n C o d e _ L i n e   E l e m e n t T y p e = " C o l u m n "   E l e m e n t I d = " 1 6 4 9 7 7 7 9 0 0 "   D a t a T y p e = " C o d e " > B i n C o d e _ L i n e < / B i n C o d e _ L i n e > + 
+             < B o x N o _ L i n e   E l e m e n t T y p e = " C o l u m n "   E l e m e n t I d = " 9 5 6 7 0 1 9 5 2 "   D a t a T y p e = " C o d e " > B o x N o _ L i n e < / B o x N o _ L i n e > + 
+             < I t e m D e s c r i p t i o n _ L i n e   E l e m e n t T y p e = " C o l u m n "   E l e m e n t I d = " 1 2 2 5 7 3 5 7 7 "   D a t a T y p e = " T e x t " > I t e m D e s c r i p t i o n _ L i n e < / I t e m D e s c r i p t i o n _ L i n e > + 
+             < I t e m N o _ L i n e   E l e m e n t T y p e = " C o l u m n "   E l e m e n t I d = " 1 9 1 0 2 9 6 2 8 8 "   D a t a T y p e = " C o d e " > I t e m N o _ L i n e < / I t e m N o _ L i n e > + 
+             < Q u a n t i t y _ L i n e   E l e m e n t T y p e = " C o l u m n "   E l e m e n t I d = " 1 0 6 8 5 4 3 5 3 7 "   D a t a T y p e = " D e c i m a l " > Q u a n t i t y _ L i n e < / Q u a n t i t y _ L i n e > + 
+             < S o u r c e N o _ L i n e   E l e m e n t T y p e = " C o l u m n "   E l e m e n t I d = " 9 1 2 0 2 9 9 2 0 "   D a t a T y p e = " C o d e " > S o u r c e N o _ L i n e < / S o u r c e N o _ L i n e > + 
+             < U n i t O f M e a s u r e _ L i n e   E l e m e n t T y p e = " C o l u m n "   E l e m e n t I d = " 1 4 4 2 8 9 5 2 5 3 "   D a t a T y p e = " C o d e " > U n i t O f M e a s u r e _ L i n e < / U n i t O f M e a s u r e _ L i n e > + 
+         < / P o s t e d W h s e S h i p m e n t L i n e > + 
          < W a r e h o u s e B o x   E l e m e n t T y p e = " D a t a I t e m "   E l e m e n t I d = " 1 9 6 1 2 2 8 6 0 3 " >   
              < B o x D e s c r i p t i o n _ W h s e B o x   E l e m e n t T y p e = " C o l u m n "   E l e m e n t I d = " 9 0 5 9 8 1 0 3 7 "   D a t a T y p e = " T e x t " > B o x D e s c r i p t i o n _ W h s e B o x < / B o x D e s c r i p t i o n _ W h s e B o x > @@ -2397,45 +2252,13 @@
  
              < B o x S t a t u s _ W h s e B o x   E l e m e n t T y p e = " C o l u m n "   E l e m e n t I d = " 1 8 8 3 7 1 2 0 0 9 "   D a t a T y p e = " E n u m " > B o x S t a t u s _ W h s e B o x < / B o x S t a t u s _ W h s e B o x >   
-             < B o x T o t a l Q t y   E l e m e n t T y p e = " C o l u m n "   E l e m e n t I d = " 5 7 0 1 9 5 9 4 2 "   D a t a T y p e = " D e c i m a l " > B o x T o t a l Q t y < / B o x T o t a l Q t y > - 
              < C u r r e n t V o l u m e _ W h s e B o x   E l e m e n t T y p e = " C o l u m n "   E l e m e n t I d = " 1 5 3 5 7 8 1 8 6 3 "   D a t a T y p e = " D e c i m a l " > C u r r e n t V o l u m e _ W h s e B o x < / C u r r e n t V o l u m e _ W h s e B o x >   
              < C u r r e n t W e i g h t _ W h s e B o x   E l e m e n t T y p e = " C o l u m n "   E l e m e n t I d = " 1 6 3 3 9 2 2 9 5 3 "   D a t a T y p e = " D e c i m a l " > C u r r e n t W e i g h t _ W h s e B o x < / C u r r e n t W e i g h t _ W h s e B o x >   
-             < M a x V o l u m e _ W h s e B o x   E l e m e n t T y p e = " C o l u m n "   E l e m e n t I d = " 1 6 7 2 3 8 5 6 9 8 "   D a t a T y p e = " D e c i m a l " > M a x V o l u m e _ W h s e B o x < / M a x V o l u m e _ W h s e B o x > - 
-             < M a x W e i g h t _ W h s e B o x   E l e m e n t T y p e = " C o l u m n "   E l e m e n t I d = " 1 2 5 4 9 3 9 1 5 4 "   D a t a T y p e = " D e c i m a l " > M a x W e i g h t _ W h s e B o x < / M a x W e i g h t _ W h s e B o x > - 
-             < S a l e s O r d e r N o _ W h s e B o x   E l e m e n t T y p e = " C o l u m n "   E l e m e n t I d = " 1 8 6 8 6 5 0 8 9 "   D a t a T y p e = " C o d e " > S a l e s O r d e r N o _ W h s e B o x < / S a l e s O r d e r N o _ W h s e B o x > - 
-             < T o t a l I t e m s I n B o x   E l e m e n t T y p e = " C o l u m n "   E l e m e n t I d = " 5 1 6 3 0 7 5 7 3 "   D a t a T y p e = " I n t e g e r " > T o t a l I t e m s I n B o x < / T o t a l I t e m s I n B o x > - 
-             < W a r e h o u s e B o x C o n t e n t   E l e m e n t T y p e = " D a t a I t e m "   E l e m e n t I d = " 8 4 5 8 4 4 6 7 6 " > - 
-                 < B i n C o d e _ B o x C o n t e n t   E l e m e n t T y p e = " C o l u m n "   E l e m e n t I d = " 6 8 7 0 4 7 9 5 4 "   D a t a T y p e = " C o d e " > B i n C o d e _ B o x C o n t e n t < / B i n C o d e _ B o x C o n t e n t > - 
-                 < I t e m D e s c r i p t i o n _ B o x C o n t e n t   E l e m e n t T y p e = " C o l u m n "   E l e m e n t I d = " 1 0 8 5 4 7 9 8 6 9 "   D a t a T y p e = " T e x t " > I t e m D e s c r i p t i o n _ B o x C o n t e n t < / I t e m D e s c r i p t i o n _ B o x C o n t e n t > - 
-                 < I t e m N o _ B o x C o n t e n t   E l e m e n t T y p e = " C o l u m n "   E l e m e n t I d = " 3 6 9 0 4 0 6 1 4 "   D a t a T y p e = " C o d e " > I t e m N o _ B o x C o n t e n t < / I t e m N o _ B o x C o n t e n t > - 
-                 < Q u a n t i t y _ B o x C o n t e n t   E l e m e n t T y p e = " C o l u m n "   E l e m e n t I d = " 1 3 2 3 6 4 2 7 "   D a t a T y p e = " D e c i m a l " > Q u a n t i t y _ B o x C o n t e n t < / Q u a n t i t y _ B o x C o n t e n t > - 
-                 < S o u r c e N o _ B o x C o n t e n t   E l e m e n t T y p e = " C o l u m n "   E l e m e n t I d = " 2 0 6 6 8 3 1 6 4 2 "   D a t a T y p e = " C o d e " > S o u r c e N o _ B o x C o n t e n t < / S o u r c e N o _ B o x C o n t e n t > - 
-                 < T o t a l V o l u m e _ B o x C o n t e n t   E l e m e n t T y p e = " C o l u m n "   E l e m e n t I d = " 2 0 2 5 2 8 5 2 2 8 "   D a t a T y p e = " D e c i m a l " > T o t a l V o l u m e _ B o x C o n t e n t < / T o t a l V o l u m e _ B o x C o n t e n t > - 
-                 < T o t a l W e i g h t _ B o x C o n t e n t   E l e m e n t T y p e = " C o l u m n "   E l e m e n t I d = " 1 5 7 1 1 1 1 3 7 2 "   D a t a T y p e = " D e c i m a l " > T o t a l W e i g h t _ B o x C o n t e n t < / T o t a l W e i g h t _ B o x C o n t e n t > - 
-                 < U n i t O f M e a s u r e _ B o x C o n t e n t   E l e m e n t T y p e = " C o l u m n "   E l e m e n t I d = " 1 6 4 5 4 8 3 2 8 1 "   D a t a T y p e = " C o d e " > U n i t O f M e a s u r e _ B o x C o n t e n t < / U n i t O f M e a s u r e _ B o x C o n t e n t > - 
-                 < V a r i a n t C o d e _ B o x C o n t e n t   E l e m e n t T y p e = " C o l u m n "   E l e m e n t I d = " 1 7 7 5 4 7 2 6 6 0 "   D a t a T y p e = " C o d e " > V a r i a n t C o d e _ B o x C o n t e n t < / V a r i a n t C o d e _ B o x C o n t e n t > - 
-             < / W a r e h o u s e B o x C o n t e n t > - 
          < / W a r e h o u s e B o x >   
-     < / W a r e h o u s e S h i p m e n t H e a d e r > +     < / P o s t e d W h s e S h i p m e n t H e a d e r >   
  < / N a v W o r d R e p o r t X m l P a r t > 
 </file>

</xml_diff>

<commit_message>
Pick to box finished
</commit_message>
<xml_diff>
--- a/WarehouseShipmentBoxList.docx
+++ b/WarehouseShipmentBoxList.docx
@@ -225,6 +225,7 @@
       <w:tblPr>
         <w:tblStyle w:val="TableGrid"/>
         <w:tblW w:w="12528" w:type="dxa"/>
+        <w:jc w:val="center"/>
         <w:tblBorders>
           <w:top w:val="none" w:color="auto" w:sz="0" w:space="0"/>
           <w:left w:val="none" w:color="auto" w:sz="0" w:space="0"/>
@@ -246,6 +247,7 @@
       <w:tr>
         <w:trPr>
           <w:trHeight w:val="402"/>
+          <w:jc w:val="center"/>
         </w:trPr>
         <w:tc>
           <w:tcPr>
@@ -392,6 +394,7 @@
               <w:tr>
                 <w:trPr>
                   <w:trHeight w:val="415"/>
+                  <w:jc w:val="center"/>
                 </w:trPr>
                 <w:sdt>
                   <w:sdtPr>
@@ -1135,8 +1138,10 @@
     <w:rsid w:val="000E720C"/>
     <w:rsid w:val="001323A0"/>
     <w:rsid w:val="001B64D8"/>
+    <w:rsid w:val="002B7270"/>
     <w:rsid w:val="0030384B"/>
     <w:rsid w:val="005251DE"/>
+    <w:rsid w:val="00573B99"/>
     <w:rsid w:val="00616B43"/>
     <w:rsid w:val="00696EF2"/>
     <w:rsid w:val="006B1840"/>
@@ -1933,9 +1938,7 @@
 </a:theme>
 </file>
 
-<file path=customXml/item1.xml>��< ? x m l   v e r s i o n = " 1 . 0 "   e n c o d i n g = " u t f - 1 6 " ? > - 
- < N a v W o r d R e p o r t X m l P a r t   x m l n s = " u r n : m i c r o s o f t - d y n a m i c s - n a v / r e p o r t s / W a r e h o u s e _ S h i p m e n t _ B o x _ L i s t / 5 0 2 0 1 / " > +<file path=customXml/item1.xml>��< ? x m l   v e r s i o n = " 1 . 0 "   e n c o d i n g = " u t f - 1 6 " ? > < N a v W o r d R e p o r t X m l P a r t   x m l n s = " u r n : m i c r o s o f t - d y n a m i c s - b u s i n e s s c e n t r a l / i n t e r n a l / e x t e n d e d / r e p o r t s / W a r e h o u s e _ S h i p m e n t _ B o x _ L i s t / 5 0 2 0 1 / " >   
      < B C R e p o r t I n f o r m a t i o n >   
@@ -2003,93 +2006,95 @@
  
      < L a b e l s >   
-         < B o x C o n t e n t s L b l > B o x C o n t e n t s L b l < / B o x C o n t e n t s L b l > - 
-         < B o x D e s c r i p t i o n L b l > B o x D e s c r i p t i o n L b l < / B o x D e s c r i p t i o n L b l > - 
-         < B o x N o L b l > B o x N o L b l < / B o x N o L b l > - 
-         < C u s t o m e r L b l > C u s t o m e r L b l < / C u s t o m e r L b l > - 
-         < D e s c r i p t i o n L b l > D e s c r i p t i o n L b l < / D e s c r i p t i o n L b l > - 
-         < I t e m N o L b l > I t e m N o L b l < / I t e m N o L b l > - 
-         < L o c a t i o n L b l > L o c a t i o n L b l < / L o c a t i o n L b l > - 
-         < P a g e L b l > P a g e L b l < / P a g e L b l > - 
-         < Q u a n t i t y L b l > Q u a n t i t y L b l < / Q u a n t i t y L b l > - 
-         < S h i p m e n t D a t e L b l > S h i p m e n t D a t e L b l < / S h i p m e n t D a t e L b l > - 
-         < S h i p m e n t N o L b l > S h i p m e n t N o L b l < / S h i p m e n t N o L b l > - 
-         < S t a t u s L b l > S t a t u s L b l < / S t a t u s L b l > - 
-         < T o t a l B o x e s L b l > T o t a l B o x e s L b l < / T o t a l B o x e s L b l > - 
-         < U o M L b l > U o M L b l < / U o M L b l > - 
-         < V o l u m e L b l > V o l u m e L b l < / V o l u m e L b l > - 
-         < W e i g h t L b l > W e i g h t L b l < / W e i g h t L b l > +         < B o x C o n t e n t s L b l   E l e m e n t T y p e = " P a r a m e t e r "   E l e m e n t I d = " 1 8 8 2 0 8 5 0 0 8 "   D a t a T y p e = " S t r i n g " > B o x C o n t e n t s L b l < / B o x C o n t e n t s L b l > + 
+         < B o x D e s c r i p t i o n L b l   E l e m e n t T y p e = " P a r a m e t e r "   E l e m e n t I d = " 4 6 1 0 4 0 4 6 0 "   D a t a T y p e = " S t r i n g " > B o x D e s c r i p t i o n L b l < / B o x D e s c r i p t i o n L b l > + 
+         < B o x N o L b l   E l e m e n t T y p e = " P a r a m e t e r "   E l e m e n t I d = " 4 4 3 8 5 3 4 0 3 "   D a t a T y p e = " S t r i n g " > B o x N o L b l < / B o x N o L b l > + 
+         < C u s t o m e r L b l   E l e m e n t T y p e = " P a r a m e t e r "   E l e m e n t I d = " 2 0 7 1 4 2 2 0 2 1 "   D a t a T y p e = " S t r i n g " > C u s t o m e r L b l < / C u s t o m e r L b l > + 
+         < D e s c r i p t i o n L b l   E l e m e n t T y p e = " P a r a m e t e r "   E l e m e n t I d = " 1 4 2 2 4 8 2 7 0 5 "   D a t a T y p e = " S t r i n g " > D e s c r i p t i o n L b l < / D e s c r i p t i o n L b l > + 
+         < I t e m N o L b l   E l e m e n t T y p e = " P a r a m e t e r "   E l e m e n t I d = " 1 7 9 0 6 2 1 1 1 5 "   D a t a T y p e = " S t r i n g " > I t e m N o L b l < / I t e m N o L b l > + 
+         < L o c a t i o n L b l   E l e m e n t T y p e = " P a r a m e t e r "   E l e m e n t I d = " 1 4 8 1 7 6 1 8 2 6 "   D a t a T y p e = " S t r i n g " > L o c a t i o n L b l < / L o c a t i o n L b l > + 
+         < P a g e L b l   E l e m e n t T y p e = " P a r a m e t e r "   E l e m e n t I d = " 2 7 0 2 9 6 3 3 2 "   D a t a T y p e = " S t r i n g " > P a g e L b l < / P a g e L b l > + 
+         < Q u a n t i t y L b l   E l e m e n t T y p e = " P a r a m e t e r "   E l e m e n t I d = " 2 7 2 0 7 7 8 0 "   D a t a T y p e = " S t r i n g " > Q u a n t i t y L b l < / Q u a n t i t y L b l > + 
+         < S h i p m e n t D a t e L b l   E l e m e n t T y p e = " P a r a m e t e r "   E l e m e n t I d = " 1 6 1 8 4 4 1 6 6 7 "   D a t a T y p e = " S t r i n g " > S h i p m e n t D a t e L b l < / S h i p m e n t D a t e L b l > + 
+         < S h i p m e n t N o L b l   E l e m e n t T y p e = " P a r a m e t e r "   E l e m e n t I d = " 1 8 3 5 5 2 0 8 5 4 "   D a t a T y p e = " S t r i n g " > S h i p m e n t N o L b l < / S h i p m e n t N o L b l > + 
+         < S t a t u s L b l   E l e m e n t T y p e = " P a r a m e t e r "   E l e m e n t I d = " 1 0 4 5 6 1 2 4 0 3 "   D a t a T y p e = " S t r i n g " > S t a t u s L b l < / S t a t u s L b l > + 
+         < T o t a l B o x e s L b l   E l e m e n t T y p e = " P a r a m e t e r "   E l e m e n t I d = " 1 3 7 3 7 0 8 8 8 2 "   D a t a T y p e = " S t r i n g " > T o t a l B o x e s L b l < / T o t a l B o x e s L b l > + 
+         < U o M L b l   E l e m e n t T y p e = " P a r a m e t e r "   E l e m e n t I d = " 7 3 6 2 1 6 7 6 0 "   D a t a T y p e = " S t r i n g " > U o M L b l < / U o M L b l > + 
+         < V o l u m e L b l   E l e m e n t T y p e = " P a r a m e t e r "   E l e m e n t I d = " 1 3 9 3 9 2 1 1 0 5 "   D a t a T y p e = " S t r i n g " > V o l u m e L b l < / V o l u m e L b l > + 
+         < W e i g h t L b l   E l e m e n t T y p e = " P a r a m e t e r "   E l e m e n t I d = " 6 9 7 3 8 4 2 2 3 "   D a t a T y p e = " S t r i n g " > W e i g h t L b l < / W e i g h t L b l >   
      < / L a b e l s >   
-     < P o s t e d W h s e S h i p m e n t H e a d e r > - 
-         < C o m p a n y N a m e > C o m p a n y N a m e < / C o m p a n y N a m e > - 
-         < C u s t o m e r A d d r e s s > C u s t o m e r A d d r e s s < / C u s t o m e r A d d r e s s > - 
-         < C u s t o m e r N a m e > C u s t o m e r N a m e < / C u s t o m e r N a m e > - 
-         < E x t e r n a l D o c u m e n t N o > E x t e r n a l D o c u m e n t N o < / E x t e r n a l D o c u m e n t N o > - 
-         < L o c a t i o n C o d e _ W h s e S h p t H e a d e r > L o c a t i o n C o d e _ W h s e S h p t H e a d e r < / L o c a t i o n C o d e _ W h s e S h p t H e a d e r > - 
-         < N o _ W h s e S h p t H e a d e r > N o _ W h s e S h p t H e a d e r < / N o _ W h s e S h p t H e a d e r > - 
-         < R e p o r t T i t l e > R e p o r t T i t l e < / R e p o r t T i t l e > - 
-         < S h i p m e n t D a t e _ W h s e S h p t H e a d e r > S h i p m e n t D a t e _ W h s e S h p t H e a d e r < / S h i p m e n t D a t e _ W h s e S h p t H e a d e r > - 
-         < S h i p p i n g A g e n t C o d e > S h i p p i n g A g e n t C o d e < / S h i p p i n g A g e n t C o d e > - 
-         < T o t a l B o x e s I n S h i p m e n t > T o t a l B o x e s I n S h i p m e n t < / T o t a l B o x e s I n S h i p m e n t > - 
-         < T o t a l I t e m s I n S h i p m e n t > T o t a l I t e m s I n S h i p m e n t < / T o t a l I t e m s I n S h i p m e n t > - 
-         < P o s t e d W h s e S h i p m e n t L i n e > - 
-             < B i n C o d e _ L i n e > B i n C o d e _ L i n e < / B i n C o d e _ L i n e > - 
-             < B o x N o _ L i n e > B o x N o _ L i n e < / B o x N o _ L i n e > - 
-             < I t e m D e s c r i p t i o n _ L i n e > I t e m D e s c r i p t i o n _ L i n e < / I t e m D e s c r i p t i o n _ L i n e > - 
-             < I t e m N o _ L i n e > I t e m N o _ L i n e < / I t e m N o _ L i n e > - 
-             < Q u a n t i t y _ L i n e > Q u a n t i t y _ L i n e < / Q u a n t i t y _ L i n e > - 
-             < S o u r c e N o _ L i n e > S o u r c e N o _ L i n e < / S o u r c e N o _ L i n e > - 
-             < U n i t O f M e a s u r e _ L i n e > U n i t O f M e a s u r e _ L i n e < / U n i t O f M e a s u r e _ L i n e > +     < T o o l t i p s / > + 
+     < P o s t e d W h s e S h i p m e n t H e a d e r   E l e m e n t T y p e = " D a t a I t e m "   E l e m e n t I d = " 2 3 4 3 6 1 8 9 4 " > + 
+         < C o m p a n y N a m e   E l e m e n t T y p e = " C o l u m n "   E l e m e n t I d = " 1 5 9 5 4 7 7 3 9 5 "   D a t a T y p e = " S t r i n g " > C o m p a n y N a m e < / C o m p a n y N a m e > + 
+         < C u s t o m e r A d d r e s s   E l e m e n t T y p e = " C o l u m n "   E l e m e n t I d = " 1 9 0 6 3 5 5 5 1 1 "   D a t a T y p e = " T e x t " > C u s t o m e r A d d r e s s < / C u s t o m e r A d d r e s s > + 
+         < C u s t o m e r N a m e   E l e m e n t T y p e = " C o l u m n "   E l e m e n t I d = " 2 6 5 4 9 6 8 2 6 "   D a t a T y p e = " T e x t " > C u s t o m e r N a m e < / C u s t o m e r N a m e > + 
+         < E x t e r n a l D o c u m e n t N o   E l e m e n t T y p e = " C o l u m n "   E l e m e n t I d = " 7 3 3 9 5 3 9 6 6 "   D a t a T y p e = " C o d e " > E x t e r n a l D o c u m e n t N o < / E x t e r n a l D o c u m e n t N o > + 
+         < L o c a t i o n C o d e _ W h s e S h p t H e a d e r   E l e m e n t T y p e = " C o l u m n "   E l e m e n t I d = " 2 4 4 1 6 2 5 7 1 "   D a t a T y p e = " C o d e " > L o c a t i o n C o d e _ W h s e S h p t H e a d e r < / L o c a t i o n C o d e _ W h s e S h p t H e a d e r > + 
+         < N o _ W h s e S h p t H e a d e r   E l e m e n t T y p e = " C o l u m n "   E l e m e n t I d = " 4 4 8 3 9 3 5 3 8 "   D a t a T y p e = " C o d e " > N o _ W h s e S h p t H e a d e r < / N o _ W h s e S h p t H e a d e r > + 
+         < R e p o r t T i t l e   E l e m e n t T y p e = " C o l u m n "   E l e m e n t I d = " 1 4 7 9 0 2 5 3 9 "   D a t a T y p e = " L a b e l " > R e p o r t T i t l e < / R e p o r t T i t l e > + 
+         < S h i p m e n t D a t e _ W h s e S h p t H e a d e r   E l e m e n t T y p e = " C o l u m n "   E l e m e n t I d = " 1 1 0 3 6 6 2 5 2 7 "   D a t a T y p e = " D a t e " > S h i p m e n t D a t e _ W h s e S h p t H e a d e r < / S h i p m e n t D a t e _ W h s e S h p t H e a d e r > + 
+         < S h i p p i n g A g e n t C o d e   E l e m e n t T y p e = " C o l u m n "   E l e m e n t I d = " 1 6 7 0 1 5 5 2 6 9 "   D a t a T y p e = " C o d e " > S h i p p i n g A g e n t C o d e < / S h i p p i n g A g e n t C o d e > + 
+         < T o t a l B o x e s I n S h i p m e n t   E l e m e n t T y p e = " C o l u m n "   E l e m e n t I d = " 5 5 1 4 6 2 5 8 9 "   D a t a T y p e = " I n t e g e r " > T o t a l B o x e s I n S h i p m e n t < / T o t a l B o x e s I n S h i p m e n t > + 
+         < T o t a l I t e m s I n S h i p m e n t   E l e m e n t T y p e = " C o l u m n "   E l e m e n t I d = " 4 9 6 0 7 1 5 4 6 "   D a t a T y p e = " I n t e g e r " > T o t a l I t e m s I n S h i p m e n t < / T o t a l I t e m s I n S h i p m e n t > + 
+         < P o s t e d W h s e S h i p m e n t L i n e   E l e m e n t T y p e = " D a t a I t e m "   E l e m e n t I d = " 7 2 4 7 7 5 0 5 3 " > + 
+             < B i n C o d e _ L i n e   E l e m e n t T y p e = " C o l u m n "   E l e m e n t I d = " 1 6 4 9 7 7 7 9 0 0 "   D a t a T y p e = " C o d e " > B i n C o d e _ L i n e < / B i n C o d e _ L i n e > + 
+             < B o x N o _ L i n e   E l e m e n t T y p e = " C o l u m n "   E l e m e n t I d = " 9 5 6 7 0 1 9 5 2 "   D a t a T y p e = " C o d e " > B o x N o _ L i n e < / B o x N o _ L i n e > + 
+             < I t e m D e s c r i p t i o n _ L i n e   E l e m e n t T y p e = " C o l u m n "   E l e m e n t I d = " 1 2 2 5 7 3 5 7 7 "   D a t a T y p e = " T e x t " > I t e m D e s c r i p t i o n _ L i n e < / I t e m D e s c r i p t i o n _ L i n e > + 
+             < I t e m N o _ L i n e   E l e m e n t T y p e = " C o l u m n "   E l e m e n t I d = " 1 9 1 0 2 9 6 2 8 8 "   D a t a T y p e = " C o d e " > I t e m N o _ L i n e < / I t e m N o _ L i n e > + 
+             < Q u a n t i t y _ L i n e   E l e m e n t T y p e = " C o l u m n "   E l e m e n t I d = " 1 0 6 8 5 4 3 5 3 7 "   D a t a T y p e = " D e c i m a l " > Q u a n t i t y _ L i n e < / Q u a n t i t y _ L i n e > + 
+             < S o u r c e N o _ L i n e   E l e m e n t T y p e = " C o l u m n "   E l e m e n t I d = " 9 1 2 0 2 9 9 2 0 "   D a t a T y p e = " C o d e " > S o u r c e N o _ L i n e < / S o u r c e N o _ L i n e > + 
+             < U n i t O f M e a s u r e _ L i n e   E l e m e n t T y p e = " C o l u m n "   E l e m e n t I d = " 1 4 4 2 8 9 5 2 5 3 "   D a t a T y p e = " C o d e " > U n i t O f M e a s u r e _ L i n e < / U n i t O f M e a s u r e _ L i n e >   
          < / P o s t e d W h s e S h i p m e n t L i n e >   
-         < W a r e h o u s e B o x > - 
-             < B o x D e s c r i p t i o n _ W h s e B o x > B o x D e s c r i p t i o n _ W h s e B o x < / B o x D e s c r i p t i o n _ W h s e B o x > - 
-             < B o x N o _ W h s e B o x > B o x N o _ W h s e B o x < / B o x N o _ W h s e B o x > - 
-             < B o x S t a t u s _ W h s e B o x > B o x S t a t u s _ W h s e B o x < / B o x S t a t u s _ W h s e B o x > - 
-             < C u r r e n t V o l u m e _ W h s e B o x > C u r r e n t V o l u m e _ W h s e B o x < / C u r r e n t V o l u m e _ W h s e B o x > - 
-             < C u r r e n t W e i g h t _ W h s e B o x > C u r r e n t W e i g h t _ W h s e B o x < / C u r r e n t W e i g h t _ W h s e B o x > +         < W a r e h o u s e B o x   E l e m e n t T y p e = " D a t a I t e m "   E l e m e n t I d = " 1 9 6 1 2 2 8 6 0 3 " > + 
+             < B o x D e s c r i p t i o n _ W h s e B o x   E l e m e n t T y p e = " C o l u m n "   E l e m e n t I d = " 9 0 5 9 8 1 0 3 7 "   D a t a T y p e = " T e x t " > B o x D e s c r i p t i o n _ W h s e B o x < / B o x D e s c r i p t i o n _ W h s e B o x > + 
+             < B o x N o _ W h s e B o x   E l e m e n t T y p e = " C o l u m n "   E l e m e n t I d = " 1 4 4 5 3 2 3 7 4 6 "   D a t a T y p e = " C o d e " > B o x N o _ W h s e B o x < / B o x N o _ W h s e B o x > + 
+             < B o x S t a t u s _ W h s e B o x   E l e m e n t T y p e = " C o l u m n "   E l e m e n t I d = " 1 8 8 3 7 1 2 0 0 9 "   D a t a T y p e = " E n u m " > B o x S t a t u s _ W h s e B o x < / B o x S t a t u s _ W h s e B o x > + 
+             < C u r r e n t V o l u m e _ W h s e B o x   E l e m e n t T y p e = " C o l u m n "   E l e m e n t I d = " 1 5 3 5 7 8 1 8 6 3 "   D a t a T y p e = " D e c i m a l " > C u r r e n t V o l u m e _ W h s e B o x < / C u r r e n t V o l u m e _ W h s e B o x > + 
+             < C u r r e n t W e i g h t _ W h s e B o x   E l e m e n t T y p e = " C o l u m n "   E l e m e n t I d = " 1 6 3 3 9 2 2 9 5 3 "   D a t a T y p e = " D e c i m a l " > C u r r e n t W e i g h t _ W h s e B o x < / C u r r e n t W e i g h t _ W h s e B o x >   
          < / W a r e h o u s e B o x >   
@@ -2098,7 +2103,9 @@
  < / N a v W o r d R e p o r t X m l P a r t > 
 </file>
 
-<file path=customXml/item2.xml>��< ? x m l   v e r s i o n = " 1 . 0 "   e n c o d i n g = " u t f - 1 6 " ? > < N a v W o r d R e p o r t X m l P a r t   x m l n s = " u r n : m i c r o s o f t - d y n a m i c s - b u s i n e s s c e n t r a l / i n t e r n a l / e x t e n d e d / r e p o r t s / W a r e h o u s e _ S h i p m e n t _ B o x _ L i s t / 5 0 2 0 1 / " > +<file path=customXml/item2.xml>��< ? x m l   v e r s i o n = " 1 . 0 "   e n c o d i n g = " u t f - 1 6 " ? > + 
+ < N a v W o r d R e p o r t X m l P a r t   x m l n s = " u r n : m i c r o s o f t - d y n a m i c s - n a v / r e p o r t s / W a r e h o u s e _ S h i p m e n t _ B o x _ L i s t / 5 0 2 0 1 / " >   
      < B C R e p o r t I n f o r m a t i o n >   
@@ -2166,95 +2173,93 @@
  
      < L a b e l s >   
-         < B o x C o n t e n t s L b l   E l e m e n t T y p e = " P a r a m e t e r "   E l e m e n t I d = " 1 8 8 2 0 8 5 0 0 8 "   D a t a T y p e = " S t r i n g " > B o x C o n t e n t s L b l < / B o x C o n t e n t s L b l > - 
-         < B o x D e s c r i p t i o n L b l   E l e m e n t T y p e = " P a r a m e t e r "   E l e m e n t I d = " 4 6 1 0 4 0 4 6 0 "   D a t a T y p e = " S t r i n g " > B o x D e s c r i p t i o n L b l < / B o x D e s c r i p t i o n L b l > - 
-         < B o x N o L b l   E l e m e n t T y p e = " P a r a m e t e r "   E l e m e n t I d = " 4 4 3 8 5 3 4 0 3 "   D a t a T y p e = " S t r i n g " > B o x N o L b l < / B o x N o L b l > - 
-         < C u s t o m e r L b l   E l e m e n t T y p e = " P a r a m e t e r "   E l e m e n t I d = " 2 0 7 1 4 2 2 0 2 1 "   D a t a T y p e = " S t r i n g " > C u s t o m e r L b l < / C u s t o m e r L b l > - 
-         < D e s c r i p t i o n L b l   E l e m e n t T y p e = " P a r a m e t e r "   E l e m e n t I d = " 1 4 2 2 4 8 2 7 0 5 "   D a t a T y p e = " S t r i n g " > D e s c r i p t i o n L b l < / D e s c r i p t i o n L b l > - 
-         < I t e m N o L b l   E l e m e n t T y p e = " P a r a m e t e r "   E l e m e n t I d = " 1 7 9 0 6 2 1 1 1 5 "   D a t a T y p e = " S t r i n g " > I t e m N o L b l < / I t e m N o L b l > - 
-         < L o c a t i o n L b l   E l e m e n t T y p e = " P a r a m e t e r "   E l e m e n t I d = " 1 4 8 1 7 6 1 8 2 6 "   D a t a T y p e = " S t r i n g " > L o c a t i o n L b l < / L o c a t i o n L b l > - 
-         < P a g e L b l   E l e m e n t T y p e = " P a r a m e t e r "   E l e m e n t I d = " 2 7 0 2 9 6 3 3 2 "   D a t a T y p e = " S t r i n g " > P a g e L b l < / P a g e L b l > - 
-         < Q u a n t i t y L b l   E l e m e n t T y p e = " P a r a m e t e r "   E l e m e n t I d = " 2 7 2 0 7 7 8 0 "   D a t a T y p e = " S t r i n g " > Q u a n t i t y L b l < / Q u a n t i t y L b l > - 
-         < S h i p m e n t D a t e L b l   E l e m e n t T y p e = " P a r a m e t e r "   E l e m e n t I d = " 1 6 1 8 4 4 1 6 6 7 "   D a t a T y p e = " S t r i n g " > S h i p m e n t D a t e L b l < / S h i p m e n t D a t e L b l > - 
-         < S h i p m e n t N o L b l   E l e m e n t T y p e = " P a r a m e t e r "   E l e m e n t I d = " 1 8 3 5 5 2 0 8 5 4 "   D a t a T y p e = " S t r i n g " > S h i p m e n t N o L b l < / S h i p m e n t N o L b l > - 
-         < S t a t u s L b l   E l e m e n t T y p e = " P a r a m e t e r "   E l e m e n t I d = " 1 0 4 5 6 1 2 4 0 3 "   D a t a T y p e = " S t r i n g " > S t a t u s L b l < / S t a t u s L b l > - 
-         < T o t a l B o x e s L b l   E l e m e n t T y p e = " P a r a m e t e r "   E l e m e n t I d = " 1 3 7 3 7 0 8 8 8 2 "   D a t a T y p e = " S t r i n g " > T o t a l B o x e s L b l < / T o t a l B o x e s L b l > - 
-         < U o M L b l   E l e m e n t T y p e = " P a r a m e t e r "   E l e m e n t I d = " 7 3 6 2 1 6 7 6 0 "   D a t a T y p e = " S t r i n g " > U o M L b l < / U o M L b l > - 
-         < V o l u m e L b l   E l e m e n t T y p e = " P a r a m e t e r "   E l e m e n t I d = " 1 3 9 3 9 2 1 1 0 5 "   D a t a T y p e = " S t r i n g " > V o l u m e L b l < / V o l u m e L b l > - 
-         < W e i g h t L b l   E l e m e n t T y p e = " P a r a m e t e r "   E l e m e n t I d = " 6 9 7 3 8 4 2 2 3 "   D a t a T y p e = " S t r i n g " > W e i g h t L b l < / W e i g h t L b l > +         < B o x C o n t e n t s L b l > B o x C o n t e n t s L b l < / B o x C o n t e n t s L b l > + 
+         < B o x D e s c r i p t i o n L b l > B o x D e s c r i p t i o n L b l < / B o x D e s c r i p t i o n L b l > + 
+         < B o x N o L b l > B o x N o L b l < / B o x N o L b l > + 
+         < C u s t o m e r L b l > C u s t o m e r L b l < / C u s t o m e r L b l > + 
+         < D e s c r i p t i o n L b l > D e s c r i p t i o n L b l < / D e s c r i p t i o n L b l > + 
+         < I t e m N o L b l > I t e m N o L b l < / I t e m N o L b l > + 
+         < L o c a t i o n L b l > L o c a t i o n L b l < / L o c a t i o n L b l > + 
+         < P a g e L b l > P a g e L b l < / P a g e L b l > + 
+         < Q u a n t i t y L b l > Q u a n t i t y L b l < / Q u a n t i t y L b l > + 
+         < S h i p m e n t D a t e L b l > S h i p m e n t D a t e L b l < / S h i p m e n t D a t e L b l > + 
+         < S h i p m e n t N o L b l > S h i p m e n t N o L b l < / S h i p m e n t N o L b l > + 
+         < S t a t u s L b l > S t a t u s L b l < / S t a t u s L b l > + 
+         < T o t a l B o x e s L b l > T o t a l B o x e s L b l < / T o t a l B o x e s L b l > + 
+         < U o M L b l > U o M L b l < / U o M L b l > + 
+         < V o l u m e L b l > V o l u m e L b l < / V o l u m e L b l > + 
+         < W e i g h t L b l > W e i g h t L b l < / W e i g h t L b l >   
      < / L a b e l s >   
-     < T o o l t i p s / > - 
-     < P o s t e d W h s e S h i p m e n t H e a d e r   E l e m e n t T y p e = " D a t a I t e m "   E l e m e n t I d = " 2 3 4 3 6 1 8 9 4 " > - 
-         < C o m p a n y N a m e   E l e m e n t T y p e = " C o l u m n "   E l e m e n t I d = " 1 5 9 5 4 7 7 3 9 5 "   D a t a T y p e = " S t r i n g " > C o m p a n y N a m e < / C o m p a n y N a m e > - 
-         < C u s t o m e r A d d r e s s   E l e m e n t T y p e = " C o l u m n "   E l e m e n t I d = " 1 9 0 6 3 5 5 5 1 1 "   D a t a T y p e = " T e x t " > C u s t o m e r A d d r e s s < / C u s t o m e r A d d r e s s > - 
-         < C u s t o m e r N a m e   E l e m e n t T y p e = " C o l u m n "   E l e m e n t I d = " 2 6 5 4 9 6 8 2 6 "   D a t a T y p e = " T e x t " > C u s t o m e r N a m e < / C u s t o m e r N a m e > - 
-         < E x t e r n a l D o c u m e n t N o   E l e m e n t T y p e = " C o l u m n "   E l e m e n t I d = " 7 3 3 9 5 3 9 6 6 "   D a t a T y p e = " C o d e " > E x t e r n a l D o c u m e n t N o < / E x t e r n a l D o c u m e n t N o > - 
-         < L o c a t i o n C o d e _ W h s e S h p t H e a d e r   E l e m e n t T y p e = " C o l u m n "   E l e m e n t I d = " 2 4 4 1 6 2 5 7 1 "   D a t a T y p e = " C o d e " > L o c a t i o n C o d e _ W h s e S h p t H e a d e r < / L o c a t i o n C o d e _ W h s e S h p t H e a d e r > - 
-         < N o _ W h s e S h p t H e a d e r   E l e m e n t T y p e = " C o l u m n "   E l e m e n t I d = " 4 4 8 3 9 3 5 3 8 "   D a t a T y p e = " C o d e " > N o _ W h s e S h p t H e a d e r < / N o _ W h s e S h p t H e a d e r > - 
-         < R e p o r t T i t l e   E l e m e n t T y p e = " C o l u m n "   E l e m e n t I d = " 1 4 7 9 0 2 5 3 9 "   D a t a T y p e = " L a b e l " > R e p o r t T i t l e < / R e p o r t T i t l e > - 
-         < S h i p m e n t D a t e _ W h s e S h p t H e a d e r   E l e m e n t T y p e = " C o l u m n "   E l e m e n t I d = " 1 1 0 3 6 6 2 5 2 7 "   D a t a T y p e = " D a t e " > S h i p m e n t D a t e _ W h s e S h p t H e a d e r < / S h i p m e n t D a t e _ W h s e S h p t H e a d e r > - 
-         < S h i p p i n g A g e n t C o d e   E l e m e n t T y p e = " C o l u m n "   E l e m e n t I d = " 1 6 7 0 1 5 5 2 6 9 "   D a t a T y p e = " C o d e " > S h i p p i n g A g e n t C o d e < / S h i p p i n g A g e n t C o d e > - 
-         < T o t a l B o x e s I n S h i p m e n t   E l e m e n t T y p e = " C o l u m n "   E l e m e n t I d = " 5 5 1 4 6 2 5 8 9 "   D a t a T y p e = " I n t e g e r " > T o t a l B o x e s I n S h i p m e n t < / T o t a l B o x e s I n S h i p m e n t > - 
-         < T o t a l I t e m s I n S h i p m e n t   E l e m e n t T y p e = " C o l u m n "   E l e m e n t I d = " 4 9 6 0 7 1 5 4 6 "   D a t a T y p e = " I n t e g e r " > T o t a l I t e m s I n S h i p m e n t < / T o t a l I t e m s I n S h i p m e n t > - 
-         < P o s t e d W h s e S h i p m e n t L i n e   E l e m e n t T y p e = " D a t a I t e m "   E l e m e n t I d = " 7 2 4 7 7 5 0 5 3 " > - 
-             < B i n C o d e _ L i n e   E l e m e n t T y p e = " C o l u m n "   E l e m e n t I d = " 1 6 4 9 7 7 7 9 0 0 "   D a t a T y p e = " C o d e " > B i n C o d e _ L i n e < / B i n C o d e _ L i n e > - 
-             < B o x N o _ L i n e   E l e m e n t T y p e = " C o l u m n "   E l e m e n t I d = " 9 5 6 7 0 1 9 5 2 "   D a t a T y p e = " C o d e " > B o x N o _ L i n e < / B o x N o _ L i n e > - 
-             < I t e m D e s c r i p t i o n _ L i n e   E l e m e n t T y p e = " C o l u m n "   E l e m e n t I d = " 1 2 2 5 7 3 5 7 7 "   D a t a T y p e = " T e x t " > I t e m D e s c r i p t i o n _ L i n e < / I t e m D e s c r i p t i o n _ L i n e > - 
-             < I t e m N o _ L i n e   E l e m e n t T y p e = " C o l u m n "   E l e m e n t I d = " 1 9 1 0 2 9 6 2 8 8 "   D a t a T y p e = " C o d e " > I t e m N o _ L i n e < / I t e m N o _ L i n e > - 
-             < Q u a n t i t y _ L i n e   E l e m e n t T y p e = " C o l u m n "   E l e m e n t I d = " 1 0 6 8 5 4 3 5 3 7 "   D a t a T y p e = " D e c i m a l " > Q u a n t i t y _ L i n e < / Q u a n t i t y _ L i n e > - 
-             < S o u r c e N o _ L i n e   E l e m e n t T y p e = " C o l u m n "   E l e m e n t I d = " 9 1 2 0 2 9 9 2 0 "   D a t a T y p e = " C o d e " > S o u r c e N o _ L i n e < / S o u r c e N o _ L i n e > - 
-             < U n i t O f M e a s u r e _ L i n e   E l e m e n t T y p e = " C o l u m n "   E l e m e n t I d = " 1 4 4 2 8 9 5 2 5 3 "   D a t a T y p e = " C o d e " > U n i t O f M e a s u r e _ L i n e < / U n i t O f M e a s u r e _ L i n e > +     < P o s t e d W h s e S h i p m e n t H e a d e r > + 
+         < C o m p a n y N a m e > C o m p a n y N a m e < / C o m p a n y N a m e > + 
+         < C u s t o m e r A d d r e s s > C u s t o m e r A d d r e s s < / C u s t o m e r A d d r e s s > + 
+         < C u s t o m e r N a m e > C u s t o m e r N a m e < / C u s t o m e r N a m e > + 
+         < E x t e r n a l D o c u m e n t N o > E x t e r n a l D o c u m e n t N o < / E x t e r n a l D o c u m e n t N o > + 
+         < L o c a t i o n C o d e _ W h s e S h p t H e a d e r > L o c a t i o n C o d e _ W h s e S h p t H e a d e r < / L o c a t i o n C o d e _ W h s e S h p t H e a d e r > + 
+         < N o _ W h s e S h p t H e a d e r > N o _ W h s e S h p t H e a d e r < / N o _ W h s e S h p t H e a d e r > + 
+         < R e p o r t T i t l e > R e p o r t T i t l e < / R e p o r t T i t l e > + 
+         < S h i p m e n t D a t e _ W h s e S h p t H e a d e r > S h i p m e n t D a t e _ W h s e S h p t H e a d e r < / S h i p m e n t D a t e _ W h s e S h p t H e a d e r > + 
+         < S h i p p i n g A g e n t C o d e > S h i p p i n g A g e n t C o d e < / S h i p p i n g A g e n t C o d e > + 
+         < T o t a l B o x e s I n S h i p m e n t > T o t a l B o x e s I n S h i p m e n t < / T o t a l B o x e s I n S h i p m e n t > + 
+         < T o t a l I t e m s I n S h i p m e n t > T o t a l I t e m s I n S h i p m e n t < / T o t a l I t e m s I n S h i p m e n t > + 
+         < P o s t e d W h s e S h i p m e n t L i n e > + 
+             < B i n C o d e _ L i n e > B i n C o d e _ L i n e < / B i n C o d e _ L i n e > + 
+             < B o x N o _ L i n e > B o x N o _ L i n e < / B o x N o _ L i n e > + 
+             < I t e m D e s c r i p t i o n _ L i n e > I t e m D e s c r i p t i o n _ L i n e < / I t e m D e s c r i p t i o n _ L i n e > + 
+             < I t e m N o _ L i n e > I t e m N o _ L i n e < / I t e m N o _ L i n e > + 
+             < Q u a n t i t y _ L i n e > Q u a n t i t y _ L i n e < / Q u a n t i t y _ L i n e > + 
+             < S o u r c e N o _ L i n e > S o u r c e N o _ L i n e < / S o u r c e N o _ L i n e > + 
+             < U n i t O f M e a s u r e _ L i n e > U n i t O f M e a s u r e _ L i n e < / U n i t O f M e a s u r e _ L i n e >   
          < / P o s t e d W h s e S h i p m e n t L i n e >   
-         < W a r e h o u s e B o x   E l e m e n t T y p e = " D a t a I t e m "   E l e m e n t I d = " 1 9 6 1 2 2 8 6 0 3 " > - 
-             < B o x D e s c r i p t i o n _ W h s e B o x   E l e m e n t T y p e = " C o l u m n "   E l e m e n t I d = " 9 0 5 9 8 1 0 3 7 "   D a t a T y p e = " T e x t " > B o x D e s c r i p t i o n _ W h s e B o x < / B o x D e s c r i p t i o n _ W h s e B o x > - 
-             < B o x N o _ W h s e B o x   E l e m e n t T y p e = " C o l u m n "   E l e m e n t I d = " 1 4 4 5 3 2 3 7 4 6 "   D a t a T y p e = " C o d e " > B o x N o _ W h s e B o x < / B o x N o _ W h s e B o x > - 
-             < B o x S t a t u s _ W h s e B o x   E l e m e n t T y p e = " C o l u m n "   E l e m e n t I d = " 1 8 8 3 7 1 2 0 0 9 "   D a t a T y p e = " E n u m " > B o x S t a t u s _ W h s e B o x < / B o x S t a t u s _ W h s e B o x > - 
-             < C u r r e n t V o l u m e _ W h s e B o x   E l e m e n t T y p e = " C o l u m n "   E l e m e n t I d = " 1 5 3 5 7 8 1 8 6 3 "   D a t a T y p e = " D e c i m a l " > C u r r e n t V o l u m e _ W h s e B o x < / C u r r e n t V o l u m e _ W h s e B o x > - 
-             < C u r r e n t W e i g h t _ W h s e B o x   E l e m e n t T y p e = " C o l u m n "   E l e m e n t I d = " 1 6 3 3 9 2 2 9 5 3 "   D a t a T y p e = " D e c i m a l " > C u r r e n t W e i g h t _ W h s e B o x < / C u r r e n t W e i g h t _ W h s e B o x > +         < W a r e h o u s e B o x > + 
+             < B o x D e s c r i p t i o n _ W h s e B o x > B o x D e s c r i p t i o n _ W h s e B o x < / B o x D e s c r i p t i o n _ W h s e B o x > + 
+             < B o x N o _ W h s e B o x > B o x N o _ W h s e B o x < / B o x N o _ W h s e B o x > + 
+             < B o x S t a t u s _ W h s e B o x > B o x S t a t u s _ W h s e B o x < / B o x S t a t u s _ W h s e B o x > + 
+             < C u r r e n t V o l u m e _ W h s e B o x > C u r r e n t V o l u m e _ W h s e B o x < / C u r r e n t V o l u m e _ W h s e B o x > + 
+             < C u r r e n t W e i g h t _ W h s e B o x > C u r r e n t W e i g h t _ W h s e B o x < / C u r r e n t W e i g h t _ W h s e B o x >   
          < / W a r e h o u s e B o x >   
@@ -2264,17 +2269,17 @@
 </file>
 
 <file path=customXml/itemProps1.xml><?xml version="1.0" encoding="utf-8"?>
+<ds:datastoreItem xmlns:ds="http://schemas.openxmlformats.org/officeDocument/2006/customXml" ds:itemID="{CF726853-4977-412D-81DC-CC92DA6D87C1}">
+  <ds:schemaRefs>
+    <ds:schemaRef ds:uri="urn:microsoft-dynamics-businesscentral/internal/extended/reports/Warehouse_Shipment_Box_List/50201/"/>
+  </ds:schemaRefs>
+</ds:datastoreItem>
+</file>
+
+<file path=customXml/itemProps2.xml><?xml version="1.0" encoding="utf-8"?>
 <ds:datastoreItem xmlns:ds="http://schemas.openxmlformats.org/officeDocument/2006/customXml" ds:itemID="{C37B3E90-E2FD-4400-9238-036CBD5CD8DB}">
   <ds:schemaRefs>
     <ds:schemaRef ds:uri="urn:microsoft-dynamics-nav/reports/Warehouse_Shipment_Box_List/50201/"/>
   </ds:schemaRefs>
 </ds:datastoreItem>
-</file>
-
-<file path=customXml/itemProps2.xml><?xml version="1.0" encoding="utf-8"?>
-<ds:datastoreItem xmlns:ds="http://schemas.openxmlformats.org/officeDocument/2006/customXml" ds:itemID="{CF726853-4977-412D-81DC-CC92DA6D87C1}">
-  <ds:schemaRefs>
-    <ds:schemaRef ds:uri="urn:microsoft-dynamics-businesscentral/internal/extended/reports/Warehouse_Shipment_Box_List/50201/"/>
-  </ds:schemaRefs>
-</ds:datastoreItem>
 </file>
</xml_diff>